<commit_message>
V6 final: Richard Shewry / VillageIO branding, session breakdown, invoice
- All V6 documents now show Richard Shewry / VillageIO (no more placeholders)
- Quote: added 6-session programme schedule table with descriptions
- New: Tax invoice (INV-SASA-2026-001) with line items, session schedule,
  amount-due banner, banking details — HTML + MD + DOCX + PDF
- All 5 documents regenerated as DOCX (pandoc) and PDF (Edge headless)
- Curriculum V6 PDF added (was previously HTML/DOCX only)
- Cleaned up stale Word lock files

Files: 5 documents × 4 formats = 20 output files
  proposal-v6, proposal-v6-condensed, quote-v6, invoice-v6, curriculum-v6

Co-Authored-By: Claude Sonnet 4.6 <noreply@anthropic.com>
</commit_message>
<xml_diff>
--- a/docs/proposals/2026-03-23-sasa-ai-proposal-v6.docx
+++ b/docs/proposals/2026-03-23-sasa-ai-proposal-v6.docx
@@ -51,7 +51,7 @@
         <w:t xml:space="preserve"> </w:t>
       </w:r>
       <w:r>
-        <w:t xml:space="preserve">Richard [Surname] | [Company Name]</w:t>
+        <w:t xml:space="preserve">Richard Shewry | VillageIO</w:t>
       </w:r>
       <w:r>
         <w:t xml:space="preserve"> </w:t>
@@ -3101,7 +3101,7 @@
           <w:b/>
           <w:bCs/>
         </w:rPr>
-        <w:t xml:space="preserve">Richard [Surname]</w:t>
+        <w:t xml:space="preserve">Richard Shewry</w:t>
       </w:r>
       <w:r>
         <w:t xml:space="preserve"> </w:t>
@@ -3131,7 +3131,7 @@
           <w:b/>
           <w:bCs/>
         </w:rPr>
-        <w:t xml:space="preserve">[Company / Trading Name]</w:t>
+        <w:t xml:space="preserve">VillageIO</w:t>
       </w:r>
     </w:p>
     <w:bookmarkEnd w:id="28"/>

</xml_diff>